<commit_message>
Build out 07 · Quantum Error Correction nav and first section
Revises the QEC taxonomy to match the updated curriculum doc (Why QEC?
plus three groups: The Mental Model, QEC Machinery, Scaling) and adds
nav entries + placeholder pages for every planned section.

Fully builds Physical vs Logical Qubits per
context_docs/PhysicalVsLogicalQubitsInstruction.docx: intro diagram,
platform-independent explanation of physical/logical qubits, an
"encoding != cloning" aside, an interactive 3-qubit encode/inject-error
demo, a comparison table, and a takeaway CTA into Errors and Noise.
Adds reusable qubit-visualization CSS primitives (color-coded logical/
physical/error/protected states) for later QEC demos to build on.

Co-Authored-By: Claude Sonnet 5 <noreply@anthropic.com>
</commit_message>
<xml_diff>
--- a/context_docs/Quantum Computing Curriculum.docx
+++ b/context_docs/Quantum Computing Curriculum.docx
@@ -379,11 +379,9 @@
           <w:numId w:val="2"/>
         </w:numPr>
       </w:pPr>
-      <w:proofErr w:type="spellStart"/>
       <w:r>
         <w:t>Qiskit</w:t>
       </w:r>
-      <w:proofErr w:type="spellEnd"/>
     </w:p>
     <w:p>
       <w:pPr>
@@ -405,11 +403,9 @@
           <w:numId w:val="2"/>
         </w:numPr>
       </w:pPr>
-      <w:proofErr w:type="spellStart"/>
       <w:r>
         <w:t>InQuanto</w:t>
       </w:r>
-      <w:proofErr w:type="spellEnd"/>
     </w:p>
     <w:p>
       <w:pPr>
@@ -431,11 +427,9 @@
           <w:numId w:val="2"/>
         </w:numPr>
       </w:pPr>
-      <w:proofErr w:type="spellStart"/>
       <w:r>
         <w:t>qBraid</w:t>
       </w:r>
-      <w:proofErr w:type="spellEnd"/>
     </w:p>
     <w:p>
       <w:pPr>
@@ -681,13 +675,8 @@
         </w:numPr>
       </w:pPr>
       <w:r>
-        <w:t xml:space="preserve">Compilation &amp; </w:t>
-      </w:r>
-      <w:proofErr w:type="spellStart"/>
-      <w:r>
-        <w:t>Transpilation</w:t>
-      </w:r>
-      <w:proofErr w:type="spellEnd"/>
+        <w:t>Compilation &amp; Transpilation</w:t>
+      </w:r>
     </w:p>
     <w:p>
       <w:pPr>
@@ -860,6 +849,18 @@
         </w:numPr>
       </w:pPr>
       <w:r>
+        <w:t>The Mental Model</w:t>
+      </w:r>
+    </w:p>
+    <w:p>
+      <w:pPr>
+        <w:pStyle w:val="ListParagraph"/>
+        <w:numPr>
+          <w:ilvl w:val="2"/>
+          <w:numId w:val="2"/>
+        </w:numPr>
+      </w:pPr>
+      <w:r>
         <w:t>Physical vs Logical Qubits</w:t>
       </w:r>
     </w:p>
@@ -867,7 +868,7 @@
       <w:pPr>
         <w:pStyle w:val="ListParagraph"/>
         <w:numPr>
-          <w:ilvl w:val="1"/>
+          <w:ilvl w:val="2"/>
           <w:numId w:val="2"/>
         </w:numPr>
       </w:pPr>
@@ -879,7 +880,7 @@
       <w:pPr>
         <w:pStyle w:val="ListParagraph"/>
         <w:numPr>
-          <w:ilvl w:val="1"/>
+          <w:ilvl w:val="2"/>
           <w:numId w:val="2"/>
         </w:numPr>
       </w:pPr>
@@ -896,6 +897,33 @@
         </w:numPr>
       </w:pPr>
       <w:r>
+        <w:t>QEC Machinery</w:t>
+      </w:r>
+    </w:p>
+    <w:p>
+      <w:pPr>
+        <w:pStyle w:val="ListParagraph"/>
+        <w:numPr>
+          <w:ilvl w:val="2"/>
+          <w:numId w:val="2"/>
+        </w:numPr>
+      </w:pPr>
+      <w:r>
+        <w:t xml:space="preserve">Encoding &amp; </w:t>
+      </w:r>
+      <w:r>
+        <w:t>Syndrome Measurement</w:t>
+      </w:r>
+    </w:p>
+    <w:p>
+      <w:pPr>
+        <w:pStyle w:val="ListParagraph"/>
+        <w:numPr>
+          <w:ilvl w:val="2"/>
+          <w:numId w:val="2"/>
+        </w:numPr>
+      </w:pPr>
+      <w:r>
         <w:t>Stabilizer Codes</w:t>
       </w:r>
     </w:p>
@@ -903,11 +931,36 @@
       <w:pPr>
         <w:pStyle w:val="ListParagraph"/>
         <w:numPr>
-          <w:ilvl w:val="1"/>
-          <w:numId w:val="2"/>
-        </w:numPr>
-      </w:pPr>
-      <w:r>
+          <w:ilvl w:val="2"/>
+          <w:numId w:val="2"/>
+        </w:numPr>
+      </w:pPr>
+      <w:r>
+        <w:t>Decoding</w:t>
+      </w:r>
+    </w:p>
+    <w:p>
+      <w:pPr>
+        <w:pStyle w:val="ListParagraph"/>
+        <w:numPr>
+          <w:ilvl w:val="1"/>
+          <w:numId w:val="2"/>
+        </w:numPr>
+      </w:pPr>
+      <w:r>
+        <w:t>Scaling</w:t>
+      </w:r>
+    </w:p>
+    <w:p>
+      <w:pPr>
+        <w:pStyle w:val="ListParagraph"/>
+        <w:numPr>
+          <w:ilvl w:val="2"/>
+          <w:numId w:val="2"/>
+        </w:numPr>
+      </w:pPr>
+      <w:r>
+        <w:lastRenderedPageBreak/>
         <w:t>Surface Codes</w:t>
       </w:r>
     </w:p>
@@ -915,30 +968,6 @@
       <w:pPr>
         <w:pStyle w:val="ListParagraph"/>
         <w:numPr>
-          <w:ilvl w:val="1"/>
-          <w:numId w:val="2"/>
-        </w:numPr>
-      </w:pPr>
-      <w:r>
-        <w:t>Syndrome Measurement</w:t>
-      </w:r>
-    </w:p>
-    <w:p>
-      <w:pPr>
-        <w:pStyle w:val="ListParagraph"/>
-        <w:numPr>
-          <w:ilvl w:val="1"/>
-          <w:numId w:val="2"/>
-        </w:numPr>
-      </w:pPr>
-      <w:r>
-        <w:t>Decoding</w:t>
-      </w:r>
-    </w:p>
-    <w:p>
-      <w:pPr>
-        <w:pStyle w:val="ListParagraph"/>
-        <w:numPr>
           <w:ilvl w:val="2"/>
           <w:numId w:val="2"/>
         </w:numPr>
@@ -951,7 +980,7 @@
       <w:pPr>
         <w:pStyle w:val="ListParagraph"/>
         <w:numPr>
-          <w:ilvl w:val="1"/>
+          <w:ilvl w:val="2"/>
           <w:numId w:val="2"/>
         </w:numPr>
       </w:pPr>
@@ -963,13 +992,12 @@
       <w:pPr>
         <w:pStyle w:val="ListParagraph"/>
         <w:numPr>
-          <w:ilvl w:val="1"/>
-          <w:numId w:val="2"/>
-        </w:numPr>
-      </w:pPr>
-      <w:r>
-        <w:lastRenderedPageBreak/>
-        <w:t>Advanced / Hardware-Aware QEC</w:t>
+          <w:ilvl w:val="2"/>
+          <w:numId w:val="2"/>
+        </w:numPr>
+      </w:pPr>
+      <w:r>
+        <w:t>Hardware-Aware QEC</w:t>
       </w:r>
     </w:p>
     <w:p>
@@ -1867,7 +1895,6 @@
   <w:style w:type="character" w:default="1" w:styleId="DefaultParagraphFont">
     <w:name w:val="Default Paragraph Font"/>
     <w:uiPriority w:val="1"/>
-    <w:semiHidden/>
     <w:unhideWhenUsed/>
   </w:style>
   <w:style w:type="table" w:default="1" w:styleId="TableNormal">

</xml_diff>